<commit_message>
Clarify optional fields in W15 student workbook
</commit_message>
<xml_diff>
--- a/worksheets/W15.docx
+++ b/worksheets/W15.docx
@@ -1563,10 +1563,10 @@
           <w:rFonts w:ascii="Arial Unicode MS" w:hAnsi="Arial Unicode MS" w:eastAsia="Arial Unicode MS"/>
           <w:b/>
           <w:i w:val="0"/>
-          <w:color w:val="1D4ED8"/>
+          <w:color w:val="5B6573"/>
           <w:sz w:val="22"/>
         </w:rPr>
-        <w:t>課堂必寫</w:t>
+        <w:t>可留白</w:t>
       </w:r>
       <w:r>
         <w:rPr>
@@ -1967,10 +1967,10 @@
           <w:rFonts w:ascii="Arial Unicode MS" w:hAnsi="Arial Unicode MS" w:eastAsia="Arial Unicode MS"/>
           <w:b/>
           <w:i w:val="0"/>
-          <w:color w:val="1D4ED8"/>
+          <w:color w:val="5B6573"/>
           <w:sz w:val="22"/>
         </w:rPr>
-        <w:t>課堂必寫</w:t>
+        <w:t>可留白</w:t>
       </w:r>
       <w:r>
         <w:rPr>

</xml_diff>